<commit_message>
feat(podcast): community feedback form (local + P2P issue store), new-episodes section, latest-releases panel, latest-episode sort, podcast-platform UI restyle; docs docx sections 11-13
</commit_message>
<xml_diff>
--- a/docs/Pharos-Technical-Documentation.docx
+++ b/docs/Pharos-Technical-Documentation.docx
@@ -1873,6 +1873,161 @@
       <w:pgNumType/>
       <w:docGrid w:linePitch="360"/>
     </w:sectPr>
+    <w:p>
+      <w:pPr>
+        <w:pStyle w:val="Heading1"/>
+      </w:pPr>
+      <w:r>
+        <w:t xml:space="preserve">11. Podcast experience — feature backlog &amp; UI redesign</w:t>
+      </w:r>
+    </w:p>
+    <w:p>
+      <w:r>
+        <w:t xml:space="preserve">Requested by the product owner (2025, in-flight backlog alignment). These requirements extend F6 (podcasts) and are reflected in the /podcast surface.</w:t>
+      </w:r>
+    </w:p>
+    <w:p>
+      <w:pPr>
+        <w:pStyle w:val="Heading2"/>
+      </w:pPr>
+      <w:r>
+        <w:t xml:space="preserve">11.1 Latest releases panel</w:t>
+      </w:r>
+    </w:p>
+    <w:p>
+      <w:r>
+        <w:t xml:space="preserve">The podcast landing page carries a dedicated panel of the LATEST RELEASES: the newest episodes across the shows the user follows (and, when no subscriptions exist, from the top chart shows), ordered strictly by publish date (newest first). The metric remains LISTENING TIME — the panel is a release feed, not a play-count ranking.</w:t>
+      </w:r>
+    </w:p>
+    <w:p>
+      <w:pPr>
+        <w:pStyle w:val="Heading2"/>
+      </w:pPr>
+      <w:r>
+        <w:t xml:space="preserve">11.2 Subscriptions with a dedicated “new episodes” section</w:t>
+      </w:r>
+    </w:p>
+    <w:p>
+      <w:r>
+        <w:t xml:space="preserve">Users subscribe to a podcast (existing pf.subs). Subscription gains a purpose: a dedicated section collects NEW EPISODES from all subscribed shows since the last time the user saw them (last-seen marker per feed, pf.subseen:&lt;feedUrl&gt;). Clicking an episode opens the show page or plays directly; the section shows a count badge per show and an honest empty state (“no new episodes — you are up to date”).</w:t>
+      </w:r>
+    </w:p>
+    <w:p>
+      <w:pPr>
+        <w:pStyle w:val="Heading2"/>
+      </w:pPr>
+      <w:r>
+        <w:t xml:space="preserve">11.3 Sort by latest episode</w:t>
+      </w:r>
+    </w:p>
+    <w:p>
+      <w:r>
+        <w:t xml:space="preserve">Podcast lists (charts, community shows) gain a “Sort: latest episode” option: shows ordered by the publish date of their most recent episode (feed snapshot data, epfeed: cache). Shows without date data rank last, honestly.</w:t>
+      </w:r>
+    </w:p>
+    <w:p>
+      <w:pPr>
+        <w:pStyle w:val="Heading2"/>
+      </w:pPr>
+      <w:r>
+        <w:t xml:space="preserve">11.4 Total UI redesign of the podcast surface</w:t>
+      </w:r>
+    </w:p>
+    <w:p>
+      <w:r>
+        <w:t xml:space="preserve">The podcast pages adopt the visual language of established podcast platforms (Spotify/Apple Podcasts): large show hero with artwork and gradient backdrop, card grids for shows, prominent per-episode play buttons with progress indication, sticky section headers, and a clear information hierarchy between “Your shows”, “New episodes”, “Latest releases” and “Charts”. The redesign stays within the app design tokens and keeps the honest-label rules (never a fake P2P badge, empty states explain WHY).</w:t>
+      </w:r>
+    </w:p>
+    <w:p>
+      <w:pPr>
+        <w:pStyle w:val="Heading1"/>
+      </w:pPr>
+      <w:r>
+        <w:t xml:space="preserve">12. Community feedback — in-app issue/suggestion form</w:t>
+      </w:r>
+    </w:p>
+    <w:p>
+      <w:r>
+        <w:t xml:space="preserve">Users can report errors and suggest changes directly in the app through a feedback form (accessible from the shell). Submissions are stored in two places, both serverless:</w:t>
+      </w:r>
+    </w:p>
+    <w:p>
+      <w:pPr>
+        <w:pStyle w:val="ListParagraph"/>
+      </w:pPr>
+      <w:r>
+        <w:t xml:space="preserve">• LOCAL: localStorage under the pf.* namespace (pf.userfeedback) so the reporter always finds their own reports, including ones not yet synced.</w:t>
+      </w:r>
+    </w:p>
+    <w:p>
+      <w:pPr>
+        <w:pStyle w:val="ListParagraph"/>
+      </w:pPr>
+      <w:r>
+        <w:t xml:space="preserve">• SHARED: the P2P catalog layer (lib/catalogstore.js, OrbitDB keyvalue under a dedicated namespace, same replication rules as the rest of the shared data). Reports written by any peer replicate to all peers — the community sees the community’s reports.</w:t>
+      </w:r>
+    </w:p>
+    <w:p>
+      <w:r>
+        <w:t xml:space="preserve">Retrieval contract: the stored records are the project’s community issue list. Each record carries: type (bug | suggestion), page (surface where it was filed), title, body (free text, length-capped), app version, timestamp, and an anonymous per-install id (no personal data). A read API returns reports sorted newest-first with dedup by content hash; developers export them (JSON) and turn them into repository issues for the suggested changes. No automatic repo write: the export→issue step is human-run, keeping the zero-server guarantee.</w:t>
+      </w:r>
+    </w:p>
+    <w:p>
+      <w:pPr>
+        <w:pStyle w:val="ListParagraph"/>
+      </w:pPr>
+      <w:r>
+        <w:t xml:space="preserve">• Anti-abuse: one report per content-hash per install; daily cap of reports per install; length caps; reports are append-only.</w:t>
+      </w:r>
+    </w:p>
+    <w:p>
+      <w:pPr>
+        <w:pStyle w:val="ListParagraph"/>
+      </w:pPr>
+      <w:r>
+        <w:t xml:space="preserve">• Honest UI: the form states that reports are shared with other users of the network (P2P), not sent to a company server.</w:t>
+      </w:r>
+    </w:p>
+    <w:p>
+      <w:pPr>
+        <w:pStyle w:val="Heading1"/>
+      </w:pPr>
+      <w:r>
+        <w:t xml:space="preserve">13. Backlog alignment (fixes/features carried in this cycle)</w:t>
+      </w:r>
+    </w:p>
+    <w:p>
+      <w:pPr>
+        <w:pStyle w:val="ListParagraph"/>
+      </w:pPr>
+      <w:r>
+        <w:t xml:space="preserve">• P1: podcast isPlayable() restricted guard wired (401/403 → episode never queued, honest label).</w:t>
+      </w:r>
+    </w:p>
+    <w:p>
+      <w:pPr>
+        <w:pStyle w:val="ListParagraph"/>
+      </w:pPr>
+      <w:r>
+        <w:t xml:space="preserve">• P1 (previous cycle): stale-cache fix for the v2: catalog keys, Lucene escaping on user input, island pf.ready stale-closure, audio error handling with bounded auto-skip, restricted-item guards, gate hang fix, hydration and internal-link fixes.</w:t>
+      </w:r>
+    </w:p>
+    <w:p>
+      <w:pPr>
+        <w:pStyle w:val="ListParagraph"/>
+      </w:pPr>
+      <w:r>
+        <w:t xml:space="preserve">• P2 structural: search state in the URL (q/c/page), format policy default “auto”, compound-track seek without setTimeout races, alternate takes keep the album in the queue, playback-rate reapply after track load, real podcast progress + resume, chapters in the player overlay, search pagination with honest empty states, accessible cards, P2P robustness (dedup/cap of announced opens), honest fill-button states, dead-wiring fixes (versionStats shape).</w:t>
+      </w:r>
+    </w:p>
+    <w:p>
+      <w:pPr>
+        <w:pStyle w:val="ListParagraph"/>
+      </w:pPr>
+      <w:r>
+        <w:t xml:space="preserve">• Design (P0): ink/ivory/brass palette refresh and splash intro are planned owner-approved items; the podcast UI redesign above is delivered in the same design language.</w:t>
+      </w:r>
+    </w:p>
   </w:body>
 </w:document>
 </file>

</xml_diff>